<commit_message>
docs(selfrecover-luks): une seule étiquette a un consommateur, disk
Le whitepaper présentait « disk », « auth » et « data-enc » comme les
usages d'un secret unifié. Seule « disk » est dérivée, par le keyscript au
démarrage : SelfRecover web dérive par un HMAC lié au site, SelfDataGuard par
son propre Argon2id, et aucun des deux ne passe par ce dérivateur. Le sel
effectif est écrit tel que le code le calcule (« : » entre sel et étiquette,
tronqué à 16 octets). Le .docx est régénéré depuis le .md.

La docstring du dérivateur disait que ces étiquettes n'existaient dans aucun
code : le mémo chiffré du lab emploie « data-enc », dans son propre schéma.
Elle dit maintenant qu'aucun module ne les dérive par ce dérivateur.

Co-Authored-By: Claude Opus 5.5 <noreply@anthropic.com>
</commit_message>
<xml_diff>
--- a/self-security/selfrecover-luks/docs/SelfRecover-LUKS_Whitepaper.docx
+++ b/self-security/selfrecover-luks/docs/SelfRecover-LUKS_Whitepaper.docx
@@ -246,7 +246,7 @@
         <w:rPr>
           <w:rStyle w:val="VerbatimChar"/>
         </w:rPr>
-        <w:t xml:space="preserve">   ▼  clés filles indépendantes (étiquettes : disk / auth / data-enc …)</w:t>
+        <w:t xml:space="preserve">   ▼  clé d'un slot LUKS (étiquette « disk »)</w:t>
       </w:r>
       <w:r>
         <w:br/>
@@ -286,13 +286,13 @@
       </w:r>
     </w:p>
     <w:bookmarkEnd w:id="24"/>
-    <w:bookmarkStart w:id="25" w:name="X273ff4a9fb2f6cbbde236e2efe161035b518444"/>
+    <w:bookmarkStart w:id="25" w:name="dérivation-cloisonnée-par-étiquette"/>
     <w:p>
       <w:pPr>
         <w:pStyle w:val="Heading2"/>
       </w:pPr>
       <w:r>
-        <w:t xml:space="preserve">4. Le secret unifié : dérivation cloisonnée par étiquette</w:t>
+        <w:t xml:space="preserve">4. Dérivation cloisonnée par étiquette</w:t>
       </w:r>
     </w:p>
     <w:p>
@@ -300,7 +300,227 @@
         <w:pStyle w:val="FirstParagraph"/>
       </w:pPr>
       <w:r>
-        <w:t xml:space="preserve">Une unique passphrase racine produit des clés filles indépendantes selon une étiquette :</w:t>
+        <w:t xml:space="preserve">D’une même passphrase, le dérivateur produit des clés indépendantes selon une étiquette.</w:t>
+      </w:r>
+      <w:r>
+        <w:t xml:space="preserve"> </w:t>
+      </w:r>
+      <w:r>
+        <w:rPr>
+          <w:b/>
+          <w:bCs/>
+        </w:rPr>
+        <w:t xml:space="preserve">Une</w:t>
+      </w:r>
+      <w:r>
+        <w:rPr>
+          <w:b/>
+          <w:bCs/>
+        </w:rPr>
+        <w:t xml:space="preserve"> </w:t>
+      </w:r>
+      <w:r>
+        <w:rPr>
+          <w:b/>
+          <w:bCs/>
+        </w:rPr>
+        <w:t xml:space="preserve">seule a un consommateur : « disk »</w:t>
+      </w:r>
+      <w:r>
+        <w:t xml:space="preserve">, la clé d’un slot LUKS, que le keyscript dérive au</w:t>
+      </w:r>
+      <w:r>
+        <w:t xml:space="preserve"> </w:t>
+      </w:r>
+      <w:r>
+        <w:t xml:space="preserve">démarrage. Le dérivateur en accepte d’autres, mais aucun module n’en emploie : SelfRecover web</w:t>
+      </w:r>
+      <w:r>
+        <w:t xml:space="preserve"> </w:t>
+      </w:r>
+      <w:r>
+        <w:t xml:space="preserve">dérive par un HMAC lié au site, SelfDataGuard par son propre Argon2id.</w:t>
+      </w:r>
+    </w:p>
+    <w:p>
+      <w:pPr>
+        <w:pStyle w:val="BodyText"/>
+      </w:pPr>
+      <w:r>
+        <w:t xml:space="preserve">Le sel effectif est dérivé par</w:t>
+      </w:r>
+      <w:r>
+        <w:t xml:space="preserve"> </w:t>
+      </w:r>
+      <w:r>
+        <w:rPr>
+          <w:rStyle w:val="VerbatimChar"/>
+        </w:rPr>
+        <w:t xml:space="preserve">SHA-256(sel_de_déploiement + ":" + étiquette)</w:t>
+      </w:r>
+      <w:r>
+        <w:t xml:space="preserve">, tronqué à 16 octets. Le</w:t>
+      </w:r>
+      <w:r>
+        <w:t xml:space="preserve"> </w:t>
+      </w:r>
+      <w:r>
+        <w:rPr>
+          <w:rStyle w:val="VerbatimChar"/>
+        </w:rPr>
+        <w:t xml:space="preserve">sel_de_déploiement</w:t>
+      </w:r>
+      <w:r>
+        <w:t xml:space="preserve"> </w:t>
+      </w:r>
+      <w:r>
+        <w:t xml:space="preserve">doit être</w:t>
+      </w:r>
+      <w:r>
+        <w:t xml:space="preserve"> </w:t>
+      </w:r>
+      <w:r>
+        <w:rPr>
+          <w:b/>
+          <w:bCs/>
+        </w:rPr>
+        <w:t xml:space="preserve">aléatoire et unique par machine</w:t>
+      </w:r>
+      <w:r>
+        <w:t xml:space="preserve"> </w:t>
+      </w:r>
+      <w:r>
+        <w:t xml:space="preserve">(issu de</w:t>
+      </w:r>
+      <w:r>
+        <w:t xml:space="preserve"> </w:t>
+      </w:r>
+      <w:r>
+        <w:rPr>
+          <w:rStyle w:val="VerbatimChar"/>
+        </w:rPr>
+        <w:t xml:space="preserve">/dev/urandom</w:t>
+      </w:r>
+      <w:r>
+        <w:t xml:space="preserve">) : c’est lui qui sépare deux déploiements et empêche tout précalcul. Deux étiquettes issues du même secret produisent des clés non corrélées : compromettre une clé dérivée sous une autre étiquette ne révèle pas la clé disque.</w:t>
+      </w:r>
+    </w:p>
+    <w:p>
+      <w:pPr>
+        <w:pStyle w:val="BodyText"/>
+      </w:pPr>
+      <w:r>
+        <w:t xml:space="preserve">La dérivation emploie</w:t>
+      </w:r>
+      <w:r>
+        <w:t xml:space="preserve"> </w:t>
+      </w:r>
+      <w:r>
+        <w:rPr>
+          <w:b/>
+          <w:bCs/>
+        </w:rPr>
+        <w:t xml:space="preserve">Argon2id</w:t>
+      </w:r>
+      <w:r>
+        <w:t xml:space="preserve"> </w:t>
+      </w:r>
+      <w:r>
+        <w:t xml:space="preserve">(memory-hard ; paramètres</w:t>
+      </w:r>
+      <w:r>
+        <w:t xml:space="preserve"> </w:t>
+      </w:r>
+      <w:r>
+        <w:rPr>
+          <w:rStyle w:val="VerbatimChar"/>
+        </w:rPr>
+        <w:t xml:space="preserve">t=3</w:t>
+      </w:r>
+      <w:r>
+        <w:t xml:space="preserve">,</w:t>
+      </w:r>
+      <w:r>
+        <w:t xml:space="preserve"> </w:t>
+      </w:r>
+      <w:r>
+        <w:rPr>
+          <w:rStyle w:val="VerbatimChar"/>
+        </w:rPr>
+        <w:t xml:space="preserve">m=64 MiB</w:t>
+      </w:r>
+      <w:r>
+        <w:t xml:space="preserve">,</w:t>
+      </w:r>
+      <w:r>
+        <w:t xml:space="preserve"> </w:t>
+      </w:r>
+      <w:r>
+        <w:rPr>
+          <w:rStyle w:val="VerbatimChar"/>
+        </w:rPr>
+        <w:t xml:space="preserve">p=4</w:t>
+      </w:r>
+      <w:r>
+        <w:t xml:space="preserve">), qui rend coûteux chaque essai d’une attaque hors-ligne sur un support volé. Ce coût est un</w:t>
+      </w:r>
+      <w:r>
+        <w:t xml:space="preserve"> </w:t>
+      </w:r>
+      <w:r>
+        <w:rPr>
+          <w:b/>
+          <w:bCs/>
+        </w:rPr>
+        <w:t xml:space="preserve">facteur de ralentissement, pas une garantie</w:t>
+      </w:r>
+      <w:r>
+        <w:t xml:space="preserve"> </w:t>
+      </w:r>
+      <w:r>
+        <w:t xml:space="preserve">: la résistance au bruteforce tient</w:t>
+      </w:r>
+      <w:r>
+        <w:t xml:space="preserve"> </w:t>
+      </w:r>
+      <w:r>
+        <w:rPr>
+          <w:b/>
+          <w:bCs/>
+        </w:rPr>
+        <w:t xml:space="preserve">d’abord à l’entropie de la passphrase de récupération</w:t>
+      </w:r>
+      <w:r>
+        <w:t xml:space="preserve"> </w:t>
+      </w:r>
+      <w:r>
+        <w:t xml:space="preserve">— Argon2id renchérit chaque essai, il ne compense pas un secret faible. Les paramètres sont un compromis (un déverrouillage au démarrage qui reste praticable) et peuvent être renforcés selon le matériel.</w:t>
+      </w:r>
+    </w:p>
+    <w:bookmarkEnd w:id="25"/>
+    <w:bookmarkStart w:id="26" w:name="X0e5ac47ab812d24147336ebc2dfc63d9ec76c8f"/>
+    <w:p>
+      <w:pPr>
+        <w:pStyle w:val="Heading2"/>
+      </w:pPr>
+      <w:r>
+        <w:t xml:space="preserve">5. Déverrouillage du volume racine au démarrage</w:t>
+      </w:r>
+    </w:p>
+    <w:p>
+      <w:pPr>
+        <w:pStyle w:val="FirstParagraph"/>
+      </w:pPr>
+      <w:r>
+        <w:t xml:space="preserve">Le volume racine est référencé dans la table de chiffrement avec un keyscript. Au démarrage, ce keyscript demande la passphrase de récupération, la dérive (étiquette « disk ») et fournit la clé à l’outil de déverrouillage, encodée en hexadécimal. L’encodage n’ajoute aucun secret : il est retenu pour la portabilité, parce qu’une clé hexadécimale s’ouvre aussi bien lue comme fichier-clé que lue comme passphrase, là où une clé en octets bruts échoue sur le second chemin. Pour l’accès distant, un serveur SSH minimal est embarqué dans l’image d’amorçage : l’administrateur s’y connecte et saisit sa passphrase à distance.</w:t>
+      </w:r>
+    </w:p>
+    <w:p>
+      <w:pPr>
+        <w:pStyle w:val="BodyText"/>
+      </w:pPr>
+      <w:r>
+        <w:t xml:space="preserve">Deux points d’attention de déploiement, souvent sous-estimés :</w:t>
       </w:r>
     </w:p>
     <w:p>
@@ -316,13 +536,13 @@
           <w:b/>
           <w:bCs/>
         </w:rPr>
-        <w:t xml:space="preserve">étiquette « disk » —</w:t>
-      </w:r>
-      <w:r>
-        <w:t xml:space="preserve"> </w:t>
-      </w:r>
-      <w:r>
-        <w:t xml:space="preserve">clé d’un slot LUKS (déverrouillage disque) ;</w:t>
+        <w:t xml:space="preserve">Bibliothèque d’exécution —</w:t>
+      </w:r>
+      <w:r>
+        <w:t xml:space="preserve"> </w:t>
+      </w:r>
+      <w:r>
+        <w:t xml:space="preserve">la fonction de dérivation, multi-thread, requiert la présence de la bibliothèque d’exécution des threads dans l’image d’amorçage (dépendance chargée dynamiquement, invisible à l’analyse statique des dépendances) ;</w:t>
       </w:r>
     </w:p>
     <w:p>
@@ -331,253 +551,6 @@
         <w:numPr>
           <w:ilvl w:val="0"/>
           <w:numId w:val="1002"/>
-        </w:numPr>
-      </w:pPr>
-      <w:r>
-        <w:rPr>
-          <w:b/>
-          <w:bCs/>
-        </w:rPr>
-        <w:t xml:space="preserve">étiquette « auth » —</w:t>
-      </w:r>
-      <w:r>
-        <w:t xml:space="preserve"> </w:t>
-      </w:r>
-      <w:r>
-        <w:t xml:space="preserve">preuve d’identité / d’accès applicatif ;</w:t>
-      </w:r>
-    </w:p>
-    <w:p>
-      <w:pPr>
-        <w:pStyle w:val="Compact"/>
-        <w:numPr>
-          <w:ilvl w:val="0"/>
-          <w:numId w:val="1002"/>
-        </w:numPr>
-      </w:pPr>
-      <w:r>
-        <w:rPr>
-          <w:b/>
-          <w:bCs/>
-        </w:rPr>
-        <w:t xml:space="preserve">étiquette « data-enc » —</w:t>
-      </w:r>
-      <w:r>
-        <w:t xml:space="preserve"> </w:t>
-      </w:r>
-      <w:r>
-        <w:t xml:space="preserve">chiffrement de données applicatives.</w:t>
-      </w:r>
-    </w:p>
-    <w:p>
-      <w:pPr>
-        <w:pStyle w:val="FirstParagraph"/>
-      </w:pPr>
-      <w:r>
-        <w:t xml:space="preserve">Le sel effectif est dérivé par</w:t>
-      </w:r>
-      <w:r>
-        <w:t xml:space="preserve"> </w:t>
-      </w:r>
-      <w:r>
-        <w:rPr>
-          <w:rStyle w:val="VerbatimChar"/>
-        </w:rPr>
-        <w:t xml:space="preserve">SHA-256(sel_de_déploiement || étiquette)</w:t>
-      </w:r>
-      <w:r>
-        <w:t xml:space="preserve">, tronqué. Le</w:t>
-      </w:r>
-      <w:r>
-        <w:t xml:space="preserve"> </w:t>
-      </w:r>
-      <w:r>
-        <w:rPr>
-          <w:rStyle w:val="VerbatimChar"/>
-        </w:rPr>
-        <w:t xml:space="preserve">sel_de_déploiement</w:t>
-      </w:r>
-      <w:r>
-        <w:t xml:space="preserve"> </w:t>
-      </w:r>
-      <w:r>
-        <w:t xml:space="preserve">doit être</w:t>
-      </w:r>
-      <w:r>
-        <w:t xml:space="preserve"> </w:t>
-      </w:r>
-      <w:r>
-        <w:rPr>
-          <w:b/>
-          <w:bCs/>
-        </w:rPr>
-        <w:t xml:space="preserve">aléatoire et unique par machine</w:t>
-      </w:r>
-      <w:r>
-        <w:t xml:space="preserve"> </w:t>
-      </w:r>
-      <w:r>
-        <w:t xml:space="preserve">(issu de</w:t>
-      </w:r>
-      <w:r>
-        <w:t xml:space="preserve"> </w:t>
-      </w:r>
-      <w:r>
-        <w:rPr>
-          <w:rStyle w:val="VerbatimChar"/>
-        </w:rPr>
-        <w:t xml:space="preserve">/dev/urandom</w:t>
-      </w:r>
-      <w:r>
-        <w:t xml:space="preserve">) : c’est lui qui sépare deux déploiements et empêche tout précalcul. Deux étiquettes issues du même secret produisent des clés non corrélées : compromettre la clé applicative ne révèle pas la clé disque.</w:t>
-      </w:r>
-    </w:p>
-    <w:p>
-      <w:pPr>
-        <w:pStyle w:val="BodyText"/>
-      </w:pPr>
-      <w:r>
-        <w:t xml:space="preserve">La dérivation emploie</w:t>
-      </w:r>
-      <w:r>
-        <w:t xml:space="preserve"> </w:t>
-      </w:r>
-      <w:r>
-        <w:rPr>
-          <w:b/>
-          <w:bCs/>
-        </w:rPr>
-        <w:t xml:space="preserve">Argon2id</w:t>
-      </w:r>
-      <w:r>
-        <w:t xml:space="preserve"> </w:t>
-      </w:r>
-      <w:r>
-        <w:t xml:space="preserve">(memory-hard ; paramètres</w:t>
-      </w:r>
-      <w:r>
-        <w:t xml:space="preserve"> </w:t>
-      </w:r>
-      <w:r>
-        <w:rPr>
-          <w:rStyle w:val="VerbatimChar"/>
-        </w:rPr>
-        <w:t xml:space="preserve">t=3</w:t>
-      </w:r>
-      <w:r>
-        <w:t xml:space="preserve">,</w:t>
-      </w:r>
-      <w:r>
-        <w:t xml:space="preserve"> </w:t>
-      </w:r>
-      <w:r>
-        <w:rPr>
-          <w:rStyle w:val="VerbatimChar"/>
-        </w:rPr>
-        <w:t xml:space="preserve">m=64 MiB</w:t>
-      </w:r>
-      <w:r>
-        <w:t xml:space="preserve">,</w:t>
-      </w:r>
-      <w:r>
-        <w:t xml:space="preserve"> </w:t>
-      </w:r>
-      <w:r>
-        <w:rPr>
-          <w:rStyle w:val="VerbatimChar"/>
-        </w:rPr>
-        <w:t xml:space="preserve">p=4</w:t>
-      </w:r>
-      <w:r>
-        <w:t xml:space="preserve">), qui rend coûteux chaque essai d’une attaque hors-ligne sur un support volé. Ce coût est un</w:t>
-      </w:r>
-      <w:r>
-        <w:t xml:space="preserve"> </w:t>
-      </w:r>
-      <w:r>
-        <w:rPr>
-          <w:b/>
-          <w:bCs/>
-        </w:rPr>
-        <w:t xml:space="preserve">facteur de ralentissement, pas une garantie</w:t>
-      </w:r>
-      <w:r>
-        <w:t xml:space="preserve"> </w:t>
-      </w:r>
-      <w:r>
-        <w:t xml:space="preserve">: la résistance au bruteforce tient</w:t>
-      </w:r>
-      <w:r>
-        <w:t xml:space="preserve"> </w:t>
-      </w:r>
-      <w:r>
-        <w:rPr>
-          <w:b/>
-          <w:bCs/>
-        </w:rPr>
-        <w:t xml:space="preserve">d’abord à l’entropie de la passphrase de récupération</w:t>
-      </w:r>
-      <w:r>
-        <w:t xml:space="preserve"> </w:t>
-      </w:r>
-      <w:r>
-        <w:t xml:space="preserve">— Argon2id renchérit chaque essai, il ne compense pas un secret faible. Les paramètres sont un compromis (un déverrouillage au démarrage qui reste praticable) et peuvent être renforcés selon le matériel.</w:t>
-      </w:r>
-    </w:p>
-    <w:bookmarkEnd w:id="25"/>
-    <w:bookmarkStart w:id="26" w:name="X0e5ac47ab812d24147336ebc2dfc63d9ec76c8f"/>
-    <w:p>
-      <w:pPr>
-        <w:pStyle w:val="Heading2"/>
-      </w:pPr>
-      <w:r>
-        <w:t xml:space="preserve">5. Déverrouillage du volume racine au démarrage</w:t>
-      </w:r>
-    </w:p>
-    <w:p>
-      <w:pPr>
-        <w:pStyle w:val="FirstParagraph"/>
-      </w:pPr>
-      <w:r>
-        <w:t xml:space="preserve">Le volume racine est référencé dans la table de chiffrement avec un keyscript. Au démarrage, ce keyscript demande la passphrase de récupération, la dérive (étiquette « disk ») et fournit la clé à l’outil de déverrouillage, encodée en hexadécimal. L’encodage n’ajoute aucun secret : il est retenu pour la portabilité, parce qu’une clé hexadécimale s’ouvre aussi bien lue comme fichier-clé que lue comme passphrase, là où une clé en octets bruts échoue sur le second chemin. Pour l’accès distant, un serveur SSH minimal est embarqué dans l’image d’amorçage : l’administrateur s’y connecte et saisit sa passphrase à distance.</w:t>
-      </w:r>
-    </w:p>
-    <w:p>
-      <w:pPr>
-        <w:pStyle w:val="BodyText"/>
-      </w:pPr>
-      <w:r>
-        <w:t xml:space="preserve">Deux points d’attention de déploiement, souvent sous-estimés :</w:t>
-      </w:r>
-    </w:p>
-    <w:p>
-      <w:pPr>
-        <w:pStyle w:val="Compact"/>
-        <w:numPr>
-          <w:ilvl w:val="0"/>
-          <w:numId w:val="1003"/>
-        </w:numPr>
-      </w:pPr>
-      <w:r>
-        <w:rPr>
-          <w:b/>
-          <w:bCs/>
-        </w:rPr>
-        <w:t xml:space="preserve">Bibliothèque d’exécution —</w:t>
-      </w:r>
-      <w:r>
-        <w:t xml:space="preserve"> </w:t>
-      </w:r>
-      <w:r>
-        <w:t xml:space="preserve">la fonction de dérivation, multi-thread, requiert la présence de la bibliothèque d’exécution des threads dans l’image d’amorçage (dépendance chargée dynamiquement, invisible à l’analyse statique des dépendances) ;</w:t>
-      </w:r>
-    </w:p>
-    <w:p>
-      <w:pPr>
-        <w:pStyle w:val="Compact"/>
-        <w:numPr>
-          <w:ilvl w:val="0"/>
-          <w:numId w:val="1003"/>
         </w:numPr>
       </w:pPr>
       <w:r>
@@ -909,7 +882,7 @@
         <w:pStyle w:val="Compact"/>
         <w:numPr>
           <w:ilvl w:val="0"/>
-          <w:numId w:val="1004"/>
+          <w:numId w:val="1003"/>
         </w:numPr>
       </w:pPr>
       <w:r>
@@ -924,6 +897,68 @@
       </w:r>
       <w:r>
         <w:t xml:space="preserve">la passphrase de récupération (mémorisée et/ou stockée) ;</w:t>
+      </w:r>
+    </w:p>
+    <w:p>
+      <w:pPr>
+        <w:pStyle w:val="Compact"/>
+        <w:numPr>
+          <w:ilvl w:val="0"/>
+          <w:numId w:val="1003"/>
+        </w:numPr>
+      </w:pPr>
+      <w:r>
+        <w:rPr>
+          <w:b/>
+          <w:bCs/>
+        </w:rPr>
+        <w:t xml:space="preserve">Sel —</w:t>
+      </w:r>
+      <w:r>
+        <w:t xml:space="preserve"> </w:t>
+      </w:r>
+      <w:r>
+        <w:t xml:space="preserve">le sel de déploiement, indispensable à la dérivation ;</w:t>
+      </w:r>
+    </w:p>
+    <w:p>
+      <w:pPr>
+        <w:pStyle w:val="Compact"/>
+        <w:numPr>
+          <w:ilvl w:val="0"/>
+          <w:numId w:val="1003"/>
+        </w:numPr>
+      </w:pPr>
+      <w:r>
+        <w:rPr>
+          <w:b/>
+          <w:bCs/>
+        </w:rPr>
+        <w:t xml:space="preserve">Sauvegardes —</w:t>
+      </w:r>
+      <w:r>
+        <w:t xml:space="preserve"> </w:t>
+      </w:r>
+      <w:r>
+        <w:t xml:space="preserve">les secrets d’accès aux sauvegardes (accès au dépôt distant, passphrase du dépôt chiffré).</w:t>
+      </w:r>
+    </w:p>
+    <w:p>
+      <w:pPr>
+        <w:pStyle w:val="FirstParagraph"/>
+      </w:pPr>
+      <w:r>
+        <w:t xml:space="preserve">Sans le sel conservé hors-site, la dérivation est irréalisable sur du matériel neuf : la passphrase seule ne suffit pas. C’est le point critique de toute architecture de ce type, et il doit être traité explicitement, non implicitement.</w:t>
+      </w:r>
+    </w:p>
+    <w:bookmarkEnd w:id="30"/>
+    <w:bookmarkStart w:id="31" w:name="déploiement-étapes-génériques"/>
+    <w:p>
+      <w:pPr>
+        <w:pStyle w:val="Heading2"/>
+      </w:pPr>
+      <w:r>
+        <w:t xml:space="preserve">10. Déploiement — étapes génériques</w:t>
       </w:r>
     </w:p>
     <w:p>
@@ -935,17 +970,7 @@
         </w:numPr>
       </w:pPr>
       <w:r>
-        <w:rPr>
-          <w:b/>
-          <w:bCs/>
-        </w:rPr>
-        <w:t xml:space="preserve">Sel —</w:t>
-      </w:r>
-      <w:r>
-        <w:t xml:space="preserve"> </w:t>
-      </w:r>
-      <w:r>
-        <w:t xml:space="preserve">le sel de déploiement, indispensable à la dérivation ;</w:t>
+        <w:t xml:space="preserve">Installer le système en chiffrement intégral (volume racine LUKS2).</w:t>
       </w:r>
     </w:p>
     <w:p>
@@ -957,35 +982,65 @@
         </w:numPr>
       </w:pPr>
       <w:r>
-        <w:rPr>
-          <w:b/>
-          <w:bCs/>
-        </w:rPr>
-        <w:t xml:space="preserve">Sauvegardes —</w:t>
-      </w:r>
-      <w:r>
-        <w:t xml:space="preserve"> </w:t>
-      </w:r>
-      <w:r>
-        <w:t xml:space="preserve">les secrets d’accès aux sauvegardes (accès au dépôt distant, passphrase du dépôt chiffré).</w:t>
-      </w:r>
-    </w:p>
-    <w:p>
-      <w:pPr>
-        <w:pStyle w:val="FirstParagraph"/>
-      </w:pPr>
-      <w:r>
-        <w:t xml:space="preserve">Sans le sel conservé hors-site, la dérivation est irréalisable sur du matériel neuf : la passphrase seule ne suffit pas. C’est le point critique de toute architecture de ce type, et il doit être traité explicitement, non implicitement.</w:t>
-      </w:r>
-    </w:p>
-    <w:bookmarkEnd w:id="30"/>
-    <w:bookmarkStart w:id="31" w:name="déploiement-étapes-génériques"/>
+        <w:t xml:space="preserve">Déployer la fonction de dérivation et le sel de déploiement.</w:t>
+      </w:r>
+    </w:p>
+    <w:p>
+      <w:pPr>
+        <w:pStyle w:val="Compact"/>
+        <w:numPr>
+          <w:ilvl w:val="0"/>
+          <w:numId w:val="1004"/>
+        </w:numPr>
+      </w:pPr>
+      <w:r>
+        <w:t xml:space="preserve">Ajouter un slot « récupération » sur chaque volume (clé dérivée, étiquette « disk »), en conservant le slot natif.</w:t>
+      </w:r>
+    </w:p>
+    <w:p>
+      <w:pPr>
+        <w:pStyle w:val="Compact"/>
+        <w:numPr>
+          <w:ilvl w:val="0"/>
+          <w:numId w:val="1004"/>
+        </w:numPr>
+      </w:pPr>
+      <w:r>
+        <w:t xml:space="preserve">Volume racine : keyscript dans la table de chiffrement + serveur SSH minimal dans l’image d’amorçage.</w:t>
+      </w:r>
+    </w:p>
+    <w:p>
+      <w:pPr>
+        <w:pStyle w:val="Compact"/>
+        <w:numPr>
+          <w:ilvl w:val="0"/>
+          <w:numId w:val="1004"/>
+        </w:numPr>
+      </w:pPr>
+      <w:r>
+        <w:t xml:space="preserve">Volumes secondaires : fichier-clé sur la racine + référence dans la table de chiffrement (montés après le pivot).</w:t>
+      </w:r>
+    </w:p>
+    <w:p>
+      <w:pPr>
+        <w:pStyle w:val="Compact"/>
+        <w:numPr>
+          <w:ilvl w:val="0"/>
+          <w:numId w:val="1004"/>
+        </w:numPr>
+      </w:pPr>
+      <w:r>
+        <w:t xml:space="preserve">Régénérer l’image d’amorçage, sauvegarder l’image précédente, puis tester par redémarrage avec filet (slot natif + accès console).</w:t>
+      </w:r>
+    </w:p>
+    <w:bookmarkEnd w:id="31"/>
+    <w:bookmarkStart w:id="32" w:name="limites-et-travaux-futurs"/>
     <w:p>
       <w:pPr>
         <w:pStyle w:val="Heading2"/>
       </w:pPr>
       <w:r>
-        <w:t xml:space="preserve">10. Déploiement — étapes génériques</w:t>
+        <w:t xml:space="preserve">11. Limites et travaux futurs</w:t>
       </w:r>
     </w:p>
     <w:p>
@@ -997,7 +1052,174 @@
         </w:numPr>
       </w:pPr>
       <w:r>
-        <w:t xml:space="preserve">Installer le système en chiffrement intégral (volume racine LUKS2).</w:t>
+        <w:rPr>
+          <w:b/>
+          <w:bCs/>
+        </w:rPr>
+        <w:t xml:space="preserve">Durcissement evil-maid :</w:t>
+      </w:r>
+      <w:r>
+        <w:t xml:space="preserve"> </w:t>
+      </w:r>
+      <w:r>
+        <w:t xml:space="preserve">l’amorçage reste en clair. Le démarrage sécurisé est la</w:t>
+      </w:r>
+      <w:r>
+        <w:t xml:space="preserve"> </w:t>
+      </w:r>
+      <w:r>
+        <w:t xml:space="preserve">seule parade réellement envisagée, et son coût a été mesuré :</w:t>
+      </w:r>
+    </w:p>
+    <w:p>
+      <w:pPr>
+        <w:pStyle w:val="Compact"/>
+        <w:numPr>
+          <w:ilvl w:val="1"/>
+          <w:numId w:val="1006"/>
+        </w:numPr>
+      </w:pPr>
+      <w:r>
+        <w:rPr>
+          <w:b/>
+          <w:bCs/>
+        </w:rPr>
+        <w:t xml:space="preserve">signer le noyau ne suffit pas.</w:t>
+      </w:r>
+      <w:r>
+        <w:t xml:space="preserve"> </w:t>
+      </w:r>
+      <w:r>
+        <w:t xml:space="preserve">L’initramfs porte le keyscript, le binaire de</w:t>
+      </w:r>
+      <w:r>
+        <w:t xml:space="preserve"> </w:t>
+      </w:r>
+      <w:r>
+        <w:t xml:space="preserve">dérivation et le sel ; il n’est pas couvert par la signature du noyau seul. Il</w:t>
+      </w:r>
+      <w:r>
+        <w:t xml:space="preserve"> </w:t>
+      </w:r>
+      <w:r>
+        <w:t xml:space="preserve">faut une</w:t>
+      </w:r>
+      <w:r>
+        <w:t xml:space="preserve"> </w:t>
+      </w:r>
+      <w:r>
+        <w:rPr>
+          <w:b/>
+          <w:bCs/>
+        </w:rPr>
+        <w:t xml:space="preserve">image unifiée</w:t>
+      </w:r>
+      <w:r>
+        <w:t xml:space="preserve"> </w:t>
+      </w:r>
+      <w:r>
+        <w:t xml:space="preserve">(noyau + initramfs + ligne de commande en un seul</w:t>
+      </w:r>
+      <w:r>
+        <w:t xml:space="preserve"> </w:t>
+      </w:r>
+      <w:r>
+        <w:t xml:space="preserve">binaire signé), donc changer de chaîne d’amorçage ;</w:t>
+      </w:r>
+    </w:p>
+    <w:p>
+      <w:pPr>
+        <w:pStyle w:val="Compact"/>
+        <w:numPr>
+          <w:ilvl w:val="1"/>
+          <w:numId w:val="1006"/>
+        </w:numPr>
+      </w:pPr>
+      <w:r>
+        <w:t xml:space="preserve">le</w:t>
+      </w:r>
+      <w:r>
+        <w:t xml:space="preserve"> </w:t>
+      </w:r>
+      <w:r>
+        <w:rPr>
+          <w:b/>
+          <w:bCs/>
+        </w:rPr>
+        <w:t xml:space="preserve">verrouillage du noyau</w:t>
+      </w:r>
+      <w:r>
+        <w:t xml:space="preserve"> </w:t>
+      </w:r>
+      <w:r>
+        <w:t xml:space="preserve">qui accompagne le démarrage sécurisé</w:t>
+      </w:r>
+      <w:r>
+        <w:t xml:space="preserve"> </w:t>
+      </w:r>
+      <w:r>
+        <w:rPr>
+          <w:b/>
+          <w:bCs/>
+        </w:rPr>
+        <w:t xml:space="preserve">supprime</w:t>
+      </w:r>
+      <w:r>
+        <w:rPr>
+          <w:b/>
+          <w:bCs/>
+        </w:rPr>
+        <w:t xml:space="preserve"> </w:t>
+      </w:r>
+      <w:r>
+        <w:rPr>
+          <w:b/>
+          <w:bCs/>
+        </w:rPr>
+        <w:t xml:space="preserve">l’hibernation</w:t>
+      </w:r>
+      <w:r>
+        <w:t xml:space="preserve"> </w:t>
+      </w:r>
+      <w:r>
+        <w:t xml:space="preserve">— l’image de veille prolongée n’étant pas vérifiable, elle est</w:t>
+      </w:r>
+      <w:r>
+        <w:t xml:space="preserve"> </w:t>
+      </w:r>
+      <w:r>
+        <w:t xml:space="preserve">refusée. C’est un renoncement fonctionnel, pas un réglage ;</w:t>
+      </w:r>
+    </w:p>
+    <w:p>
+      <w:pPr>
+        <w:pStyle w:val="Compact"/>
+        <w:numPr>
+          <w:ilvl w:val="1"/>
+          <w:numId w:val="1006"/>
+        </w:numPr>
+      </w:pPr>
+      <w:r>
+        <w:t xml:space="preserve">à recommander par défaut</w:t>
+      </w:r>
+      <w:r>
+        <w:t xml:space="preserve"> </w:t>
+      </w:r>
+      <w:r>
+        <w:rPr>
+          <w:b/>
+          <w:bCs/>
+        </w:rPr>
+        <w:t xml:space="preserve">sur poste fixe</w:t>
+      </w:r>
+      <w:r>
+        <w:t xml:space="preserve">, où l’hibernation ne manque pas ;</w:t>
+      </w:r>
+      <w:r>
+        <w:t xml:space="preserve"> </w:t>
+      </w:r>
+      <w:r>
+        <w:t xml:space="preserve">sur portable, l’arbitrage revient à l’utilisateur.</w:t>
       </w:r>
     </w:p>
     <w:p>
@@ -1009,7 +1231,17 @@
         </w:numPr>
       </w:pPr>
       <w:r>
-        <w:t xml:space="preserve">Déployer la fonction de dérivation et le sel de déploiement.</w:t>
+        <w:rPr>
+          <w:b/>
+          <w:bCs/>
+        </w:rPr>
+        <w:t xml:space="preserve">Mesure d’intégrité matérielle</w:t>
+      </w:r>
+      <w:r>
+        <w:t xml:space="preserve"> </w:t>
+      </w:r>
+      <w:r>
+        <w:t xml:space="preserve">(TPM) : à étudier, non instruite à ce jour.</w:t>
       </w:r>
     </w:p>
     <w:p>
@@ -1021,7 +1253,17 @@
         </w:numPr>
       </w:pPr>
       <w:r>
-        <w:t xml:space="preserve">Ajouter un slot « récupération » sur chaque volume (clé dérivée, étiquette « disk »), en conservant le slot natif.</w:t>
+        <w:rPr>
+          <w:b/>
+          <w:bCs/>
+        </w:rPr>
+        <w:t xml:space="preserve">Quorum distribué :</w:t>
+      </w:r>
+      <w:r>
+        <w:t xml:space="preserve"> </w:t>
+      </w:r>
+      <w:r>
+        <w:t xml:space="preserve">déverrouillage automatique par consensus de témoins, sans saisie, en réflexion.</w:t>
       </w:r>
     </w:p>
     <w:p>
@@ -1030,275 +1272,6 @@
         <w:numPr>
           <w:ilvl w:val="0"/>
           <w:numId w:val="1005"/>
-        </w:numPr>
-      </w:pPr>
-      <w:r>
-        <w:t xml:space="preserve">Volume racine : keyscript dans la table de chiffrement + serveur SSH minimal dans l’image d’amorçage.</w:t>
-      </w:r>
-    </w:p>
-    <w:p>
-      <w:pPr>
-        <w:pStyle w:val="Compact"/>
-        <w:numPr>
-          <w:ilvl w:val="0"/>
-          <w:numId w:val="1005"/>
-        </w:numPr>
-      </w:pPr>
-      <w:r>
-        <w:t xml:space="preserve">Volumes secondaires : fichier-clé sur la racine + référence dans la table de chiffrement (montés après le pivot).</w:t>
-      </w:r>
-    </w:p>
-    <w:p>
-      <w:pPr>
-        <w:pStyle w:val="Compact"/>
-        <w:numPr>
-          <w:ilvl w:val="0"/>
-          <w:numId w:val="1005"/>
-        </w:numPr>
-      </w:pPr>
-      <w:r>
-        <w:t xml:space="preserve">Régénérer l’image d’amorçage, sauvegarder l’image précédente, puis tester par redémarrage avec filet (slot natif + accès console).</w:t>
-      </w:r>
-    </w:p>
-    <w:bookmarkEnd w:id="31"/>
-    <w:bookmarkStart w:id="32" w:name="limites-et-travaux-futurs"/>
-    <w:p>
-      <w:pPr>
-        <w:pStyle w:val="Heading2"/>
-      </w:pPr>
-      <w:r>
-        <w:t xml:space="preserve">11. Limites et travaux futurs</w:t>
-      </w:r>
-    </w:p>
-    <w:p>
-      <w:pPr>
-        <w:pStyle w:val="Compact"/>
-        <w:numPr>
-          <w:ilvl w:val="0"/>
-          <w:numId w:val="1006"/>
-        </w:numPr>
-      </w:pPr>
-      <w:r>
-        <w:rPr>
-          <w:b/>
-          <w:bCs/>
-        </w:rPr>
-        <w:t xml:space="preserve">Durcissement evil-maid :</w:t>
-      </w:r>
-      <w:r>
-        <w:t xml:space="preserve"> </w:t>
-      </w:r>
-      <w:r>
-        <w:t xml:space="preserve">l’amorçage reste en clair. Le démarrage sécurisé est la</w:t>
-      </w:r>
-      <w:r>
-        <w:t xml:space="preserve"> </w:t>
-      </w:r>
-      <w:r>
-        <w:t xml:space="preserve">seule parade réellement envisagée, et son coût a été mesuré :</w:t>
-      </w:r>
-    </w:p>
-    <w:p>
-      <w:pPr>
-        <w:pStyle w:val="Compact"/>
-        <w:numPr>
-          <w:ilvl w:val="1"/>
-          <w:numId w:val="1007"/>
-        </w:numPr>
-      </w:pPr>
-      <w:r>
-        <w:rPr>
-          <w:b/>
-          <w:bCs/>
-        </w:rPr>
-        <w:t xml:space="preserve">signer le noyau ne suffit pas.</w:t>
-      </w:r>
-      <w:r>
-        <w:t xml:space="preserve"> </w:t>
-      </w:r>
-      <w:r>
-        <w:t xml:space="preserve">L’initramfs porte le keyscript, le binaire de</w:t>
-      </w:r>
-      <w:r>
-        <w:t xml:space="preserve"> </w:t>
-      </w:r>
-      <w:r>
-        <w:t xml:space="preserve">dérivation et le sel ; il n’est pas couvert par la signature du noyau seul. Il</w:t>
-      </w:r>
-      <w:r>
-        <w:t xml:space="preserve"> </w:t>
-      </w:r>
-      <w:r>
-        <w:t xml:space="preserve">faut une</w:t>
-      </w:r>
-      <w:r>
-        <w:t xml:space="preserve"> </w:t>
-      </w:r>
-      <w:r>
-        <w:rPr>
-          <w:b/>
-          <w:bCs/>
-        </w:rPr>
-        <w:t xml:space="preserve">image unifiée</w:t>
-      </w:r>
-      <w:r>
-        <w:t xml:space="preserve"> </w:t>
-      </w:r>
-      <w:r>
-        <w:t xml:space="preserve">(noyau + initramfs + ligne de commande en un seul</w:t>
-      </w:r>
-      <w:r>
-        <w:t xml:space="preserve"> </w:t>
-      </w:r>
-      <w:r>
-        <w:t xml:space="preserve">binaire signé), donc changer de chaîne d’amorçage ;</w:t>
-      </w:r>
-    </w:p>
-    <w:p>
-      <w:pPr>
-        <w:pStyle w:val="Compact"/>
-        <w:numPr>
-          <w:ilvl w:val="1"/>
-          <w:numId w:val="1007"/>
-        </w:numPr>
-      </w:pPr>
-      <w:r>
-        <w:t xml:space="preserve">le</w:t>
-      </w:r>
-      <w:r>
-        <w:t xml:space="preserve"> </w:t>
-      </w:r>
-      <w:r>
-        <w:rPr>
-          <w:b/>
-          <w:bCs/>
-        </w:rPr>
-        <w:t xml:space="preserve">verrouillage du noyau</w:t>
-      </w:r>
-      <w:r>
-        <w:t xml:space="preserve"> </w:t>
-      </w:r>
-      <w:r>
-        <w:t xml:space="preserve">qui accompagne le démarrage sécurisé</w:t>
-      </w:r>
-      <w:r>
-        <w:t xml:space="preserve"> </w:t>
-      </w:r>
-      <w:r>
-        <w:rPr>
-          <w:b/>
-          <w:bCs/>
-        </w:rPr>
-        <w:t xml:space="preserve">supprime</w:t>
-      </w:r>
-      <w:r>
-        <w:rPr>
-          <w:b/>
-          <w:bCs/>
-        </w:rPr>
-        <w:t xml:space="preserve"> </w:t>
-      </w:r>
-      <w:r>
-        <w:rPr>
-          <w:b/>
-          <w:bCs/>
-        </w:rPr>
-        <w:t xml:space="preserve">l’hibernation</w:t>
-      </w:r>
-      <w:r>
-        <w:t xml:space="preserve"> </w:t>
-      </w:r>
-      <w:r>
-        <w:t xml:space="preserve">— l’image de veille prolongée n’étant pas vérifiable, elle est</w:t>
-      </w:r>
-      <w:r>
-        <w:t xml:space="preserve"> </w:t>
-      </w:r>
-      <w:r>
-        <w:t xml:space="preserve">refusée. C’est un renoncement fonctionnel, pas un réglage ;</w:t>
-      </w:r>
-    </w:p>
-    <w:p>
-      <w:pPr>
-        <w:pStyle w:val="Compact"/>
-        <w:numPr>
-          <w:ilvl w:val="1"/>
-          <w:numId w:val="1007"/>
-        </w:numPr>
-      </w:pPr>
-      <w:r>
-        <w:t xml:space="preserve">à recommander par défaut</w:t>
-      </w:r>
-      <w:r>
-        <w:t xml:space="preserve"> </w:t>
-      </w:r>
-      <w:r>
-        <w:rPr>
-          <w:b/>
-          <w:bCs/>
-        </w:rPr>
-        <w:t xml:space="preserve">sur poste fixe</w:t>
-      </w:r>
-      <w:r>
-        <w:t xml:space="preserve">, où l’hibernation ne manque pas ;</w:t>
-      </w:r>
-      <w:r>
-        <w:t xml:space="preserve"> </w:t>
-      </w:r>
-      <w:r>
-        <w:t xml:space="preserve">sur portable, l’arbitrage revient à l’utilisateur.</w:t>
-      </w:r>
-    </w:p>
-    <w:p>
-      <w:pPr>
-        <w:pStyle w:val="Compact"/>
-        <w:numPr>
-          <w:ilvl w:val="0"/>
-          <w:numId w:val="1006"/>
-        </w:numPr>
-      </w:pPr>
-      <w:r>
-        <w:rPr>
-          <w:b/>
-          <w:bCs/>
-        </w:rPr>
-        <w:t xml:space="preserve">Mesure d’intégrité matérielle</w:t>
-      </w:r>
-      <w:r>
-        <w:t xml:space="preserve"> </w:t>
-      </w:r>
-      <w:r>
-        <w:t xml:space="preserve">(TPM) : à étudier, non instruite à ce jour.</w:t>
-      </w:r>
-    </w:p>
-    <w:p>
-      <w:pPr>
-        <w:pStyle w:val="Compact"/>
-        <w:numPr>
-          <w:ilvl w:val="0"/>
-          <w:numId w:val="1006"/>
-        </w:numPr>
-      </w:pPr>
-      <w:r>
-        <w:rPr>
-          <w:b/>
-          <w:bCs/>
-        </w:rPr>
-        <w:t xml:space="preserve">Quorum distribué :</w:t>
-      </w:r>
-      <w:r>
-        <w:t xml:space="preserve"> </w:t>
-      </w:r>
-      <w:r>
-        <w:t xml:space="preserve">déverrouillage automatique par consensus de témoins, sans saisie, en réflexion.</w:t>
-      </w:r>
-    </w:p>
-    <w:p>
-      <w:pPr>
-        <w:pStyle w:val="Compact"/>
-        <w:numPr>
-          <w:ilvl w:val="0"/>
-          <w:numId w:val="1006"/>
         </w:numPr>
       </w:pPr>
       <w:r>
@@ -1615,9 +1588,6 @@
     <w:abstractNumId w:val="991"/>
   </w:num>
   <w:num w:numId="1004">
-    <w:abstractNumId w:val="991"/>
-  </w:num>
-  <w:num w:numId="1005">
     <w:abstractNumId w:val="99411"/>
     <w:lvlOverride w:ilvl="0">
       <w:startOverride w:val="1"/>
@@ -1647,10 +1617,10 @@
       <w:startOverride w:val="1"/>
     </w:lvlOverride>
   </w:num>
-  <w:num w:numId="1006">
+  <w:num w:numId="1005">
     <w:abstractNumId w:val="991"/>
   </w:num>
-  <w:num w:numId="1007">
+  <w:num w:numId="1006">
     <w:abstractNumId w:val="991"/>
   </w:num>
 </w:numbering>

</xml_diff>

<commit_message>
docs(selfrecover-luks): le whitepaper suit le module en 0.6.2
En-tête en 0.6.2. Le §5 dit que la clé d'amorçage peut ne mener qu'au script
de secours ; le §8 nomme ce que l'outillage garde depuis la 0.6 : format du
slot inscrit, borne de lecture accordée à la clé, preuve par le dérivateur de
l'amorçage, image vérifiée après régénération. DOCX régénéré depuis le .md.

Co-Authored-By: Claude Opus 5.5 <noreply@anthropic.com>
</commit_message>
<xml_diff>
--- a/self-security/selfrecover-luks/docs/SelfRecover-LUKS_Whitepaper.docx
+++ b/self-security/selfrecover-luks/docs/SelfRecover-LUKS_Whitepaper.docx
@@ -48,7 +48,7 @@
         <w:pStyle w:val="FirstParagraph"/>
       </w:pPr>
       <w:r>
-        <w:t xml:space="preserve">Écosystème MySelf — pilier Self-Security · Version 0.5.0 · 22 septembre 2026 · AGPL-3.0-or-later</w:t>
+        <w:t xml:space="preserve">Écosystème MySelf — pilier Self-Security · Version 0.6.2 · 4 octobre 2026 · AGPL-3.0-or-later</w:t>
       </w:r>
       <w:r>
         <w:t xml:space="preserve"> </w:t>
@@ -512,7 +512,7 @@
         <w:pStyle w:val="FirstParagraph"/>
       </w:pPr>
       <w:r>
-        <w:t xml:space="preserve">Le volume racine est référencé dans la table de chiffrement avec un keyscript. Au démarrage, ce keyscript demande la passphrase de récupération, la dérive (étiquette « disk ») et fournit la clé à l’outil de déverrouillage, encodée en hexadécimal. L’encodage n’ajoute aucun secret : il est retenu pour la portabilité, parce qu’une clé hexadécimale s’ouvre aussi bien lue comme fichier-clé que lue comme passphrase, là où une clé en octets bruts échoue sur le second chemin. Pour l’accès distant, un serveur SSH minimal est embarqué dans l’image d’amorçage : l’administrateur s’y connecte et saisit sa passphrase à distance.</w:t>
+        <w:t xml:space="preserve">Le volume racine est référencé dans la table de chiffrement avec un keyscript. Au démarrage, ce keyscript demande la passphrase de récupération, la dérive (étiquette « disk ») et fournit la clé à l’outil de déverrouillage, encodée en hexadécimal. L’encodage n’ajoute aucun secret : il est retenu pour la portabilité, parce qu’une clé hexadécimale s’ouvre aussi bien lue comme fichier-clé que lue comme passphrase, là où une clé en octets bruts échoue sur le second chemin. Pour l’accès distant, un serveur SSH minimal est embarqué dans l’image d’amorçage : l’administrateur s’y connecte et saisit sa passphrase à distance. Sa clé peut être restreinte à un script de secours, qui propose la passphrase de récupération ou la passphrase native, sans ouvrir de shell.</w:t>
       </w:r>
     </w:p>
     <w:p>
@@ -859,22 +859,12 @@
         <w:t xml:space="preserve">Chaque volume conserve un slot « natif » (passphrase classique), indépendant du mécanisme de récupération. En cas de défaillance du keyscript, l’administrateur ouvre le volume manuellement via ce slot, puis poursuit l’amorçage. Des sauvegardes de l’image d’amorçage et de la configuration autorisent un retour arrière immédiat. Principe directeur : aucun point de défaillance unique du côté du déverrouillage.</w:t>
       </w:r>
     </w:p>
-    <w:bookmarkEnd w:id="29"/>
-    <w:bookmarkStart w:id="30" w:name="récupération-après-catastrophe"/>
-    <w:p>
-      <w:pPr>
-        <w:pStyle w:val="Heading2"/>
-      </w:pPr>
-      <w:r>
-        <w:t xml:space="preserve">9. Récupération après catastrophe</w:t>
-      </w:r>
-    </w:p>
-    <w:p>
-      <w:pPr>
-        <w:pStyle w:val="FirstParagraph"/>
-      </w:pPr>
-      <w:r>
-        <w:t xml:space="preserve">Reconstruire le système après destruction du matériel suppose de conserver, HORS du serveur, trois éléments :</w:t>
+    <w:p>
+      <w:pPr>
+        <w:pStyle w:val="BodyText"/>
+      </w:pPr>
+      <w:r>
+        <w:t xml:space="preserve">L’outillage garde aussi ce qui rendrait une machine muette au démarrage :</w:t>
       </w:r>
     </w:p>
     <w:p>
@@ -890,13 +880,25 @@
           <w:b/>
           <w:bCs/>
         </w:rPr>
-        <w:t xml:space="preserve">Passphrase —</w:t>
-      </w:r>
-      <w:r>
-        <w:t xml:space="preserve"> </w:t>
-      </w:r>
-      <w:r>
-        <w:t xml:space="preserve">la passphrase de récupération (mémorisée et/ou stockée) ;</w:t>
+        <w:t xml:space="preserve">Format du slot inscrit —</w:t>
+      </w:r>
+      <w:r>
+        <w:t xml:space="preserve"> </w:t>
+      </w:r>
+      <w:r>
+        <w:t xml:space="preserve">l’installation refuse de poser un keyscript d’un autre format que</w:t>
+      </w:r>
+      <w:r>
+        <w:t xml:space="preserve"> </w:t>
+      </w:r>
+      <w:r>
+        <w:t xml:space="preserve">le slot enrôlé (hexadécimal ou octets bruts), et refuse de remplacer un keyscript en place sans</w:t>
+      </w:r>
+      <w:r>
+        <w:t xml:space="preserve"> </w:t>
+      </w:r>
+      <w:r>
+        <w:t xml:space="preserve">ce marqueur ;</w:t>
       </w:r>
     </w:p>
     <w:p>
@@ -912,13 +914,19 @@
           <w:b/>
           <w:bCs/>
         </w:rPr>
-        <w:t xml:space="preserve">Sel —</w:t>
-      </w:r>
-      <w:r>
-        <w:t xml:space="preserve"> </w:t>
-      </w:r>
-      <w:r>
-        <w:t xml:space="preserve">le sel de déploiement, indispensable à la dérivation ;</w:t>
+        <w:t xml:space="preserve">Borne de lecture accordée à la clé —</w:t>
+      </w:r>
+      <w:r>
+        <w:t xml:space="preserve"> </w:t>
+      </w:r>
+      <w:r>
+        <w:t xml:space="preserve">la longueur que la table de chiffrement fait lire</w:t>
+      </w:r>
+      <w:r>
+        <w:t xml:space="preserve"> </w:t>
+      </w:r>
+      <w:r>
+        <w:t xml:space="preserve">correspond au format : 64 caractères en hexadécimal, 32 octets en brut ;</w:t>
       </w:r>
     </w:p>
     <w:p>
@@ -934,13 +942,57 @@
           <w:b/>
           <w:bCs/>
         </w:rPr>
-        <w:t xml:space="preserve">Sauvegardes —</w:t>
-      </w:r>
-      <w:r>
-        <w:t xml:space="preserve"> </w:t>
-      </w:r>
-      <w:r>
-        <w:t xml:space="preserve">les secrets d’accès aux sauvegardes (accès au dépôt distant, passphrase du dépôt chiffré).</w:t>
+        <w:t xml:space="preserve">Preuve par le dérivateur de l’amorçage —</w:t>
+      </w:r>
+      <w:r>
+        <w:t xml:space="preserve"> </w:t>
+      </w:r>
+      <w:r>
+        <w:t xml:space="preserve">quand il est présent, c’est le binaire que lira le</w:t>
+      </w:r>
+      <w:r>
+        <w:t xml:space="preserve"> </w:t>
+      </w:r>
+      <w:r>
+        <w:t xml:space="preserve">keyscript qui rouvre le slot enrôlé, avant que le keyscript ne soit branché ;</w:t>
+      </w:r>
+    </w:p>
+    <w:p>
+      <w:pPr>
+        <w:pStyle w:val="Compact"/>
+        <w:numPr>
+          <w:ilvl w:val="0"/>
+          <w:numId w:val="1003"/>
+        </w:numPr>
+      </w:pPr>
+      <w:r>
+        <w:rPr>
+          <w:b/>
+          <w:bCs/>
+        </w:rPr>
+        <w:t xml:space="preserve">Image vérifiée après chaque régénération —</w:t>
+      </w:r>
+      <w:r>
+        <w:t xml:space="preserve"> </w:t>
+      </w:r>
+      <w:r>
+        <w:t xml:space="preserve">keyscript, script de secours quand l’image</w:t>
+      </w:r>
+      <w:r>
+        <w:t xml:space="preserve"> </w:t>
+      </w:r>
+      <w:r>
+        <w:t xml:space="preserve">embarque le serveur SSH, borne de lecture.</w:t>
+      </w:r>
+    </w:p>
+    <w:bookmarkEnd w:id="29"/>
+    <w:bookmarkStart w:id="30" w:name="récupération-après-catastrophe"/>
+    <w:p>
+      <w:pPr>
+        <w:pStyle w:val="Heading2"/>
+      </w:pPr>
+      <w:r>
+        <w:t xml:space="preserve">9. Récupération après catastrophe</w:t>
       </w:r>
     </w:p>
     <w:p>
@@ -948,17 +1000,7 @@
         <w:pStyle w:val="FirstParagraph"/>
       </w:pPr>
       <w:r>
-        <w:t xml:space="preserve">Sans le sel conservé hors-site, la dérivation est irréalisable sur du matériel neuf : la passphrase seule ne suffit pas. C’est le point critique de toute architecture de ce type, et il doit être traité explicitement, non implicitement.</w:t>
-      </w:r>
-    </w:p>
-    <w:bookmarkEnd w:id="30"/>
-    <w:bookmarkStart w:id="31" w:name="déploiement-étapes-génériques"/>
-    <w:p>
-      <w:pPr>
-        <w:pStyle w:val="Heading2"/>
-      </w:pPr>
-      <w:r>
-        <w:t xml:space="preserve">10. Déploiement — étapes génériques</w:t>
+        <w:t xml:space="preserve">Reconstruire le système après destruction du matériel suppose de conserver, HORS du serveur, trois éléments :</w:t>
       </w:r>
     </w:p>
     <w:p>
@@ -970,7 +1012,17 @@
         </w:numPr>
       </w:pPr>
       <w:r>
-        <w:t xml:space="preserve">Installer le système en chiffrement intégral (volume racine LUKS2).</w:t>
+        <w:rPr>
+          <w:b/>
+          <w:bCs/>
+        </w:rPr>
+        <w:t xml:space="preserve">Passphrase —</w:t>
+      </w:r>
+      <w:r>
+        <w:t xml:space="preserve"> </w:t>
+      </w:r>
+      <w:r>
+        <w:t xml:space="preserve">la passphrase de récupération (mémorisée et/ou stockée) ;</w:t>
       </w:r>
     </w:p>
     <w:p>
@@ -982,7 +1034,17 @@
         </w:numPr>
       </w:pPr>
       <w:r>
-        <w:t xml:space="preserve">Déployer la fonction de dérivation et le sel de déploiement.</w:t>
+        <w:rPr>
+          <w:b/>
+          <w:bCs/>
+        </w:rPr>
+        <w:t xml:space="preserve">Sel —</w:t>
+      </w:r>
+      <w:r>
+        <w:t xml:space="preserve"> </w:t>
+      </w:r>
+      <w:r>
+        <w:t xml:space="preserve">le sel de déploiement, indispensable à la dérivation ;</w:t>
       </w:r>
     </w:p>
     <w:p>
@@ -994,53 +1056,35 @@
         </w:numPr>
       </w:pPr>
       <w:r>
-        <w:t xml:space="preserve">Ajouter un slot « récupération » sur chaque volume (clé dérivée, étiquette « disk »), en conservant le slot natif.</w:t>
-      </w:r>
-    </w:p>
-    <w:p>
-      <w:pPr>
-        <w:pStyle w:val="Compact"/>
-        <w:numPr>
-          <w:ilvl w:val="0"/>
-          <w:numId w:val="1004"/>
-        </w:numPr>
-      </w:pPr>
-      <w:r>
-        <w:t xml:space="preserve">Volume racine : keyscript dans la table de chiffrement + serveur SSH minimal dans l’image d’amorçage.</w:t>
-      </w:r>
-    </w:p>
-    <w:p>
-      <w:pPr>
-        <w:pStyle w:val="Compact"/>
-        <w:numPr>
-          <w:ilvl w:val="0"/>
-          <w:numId w:val="1004"/>
-        </w:numPr>
-      </w:pPr>
-      <w:r>
-        <w:t xml:space="preserve">Volumes secondaires : fichier-clé sur la racine + référence dans la table de chiffrement (montés après le pivot).</w:t>
-      </w:r>
-    </w:p>
-    <w:p>
-      <w:pPr>
-        <w:pStyle w:val="Compact"/>
-        <w:numPr>
-          <w:ilvl w:val="0"/>
-          <w:numId w:val="1004"/>
-        </w:numPr>
-      </w:pPr>
-      <w:r>
-        <w:t xml:space="preserve">Régénérer l’image d’amorçage, sauvegarder l’image précédente, puis tester par redémarrage avec filet (slot natif + accès console).</w:t>
-      </w:r>
-    </w:p>
-    <w:bookmarkEnd w:id="31"/>
-    <w:bookmarkStart w:id="32" w:name="limites-et-travaux-futurs"/>
+        <w:rPr>
+          <w:b/>
+          <w:bCs/>
+        </w:rPr>
+        <w:t xml:space="preserve">Sauvegardes —</w:t>
+      </w:r>
+      <w:r>
+        <w:t xml:space="preserve"> </w:t>
+      </w:r>
+      <w:r>
+        <w:t xml:space="preserve">les secrets d’accès aux sauvegardes (accès au dépôt distant, passphrase du dépôt chiffré).</w:t>
+      </w:r>
+    </w:p>
+    <w:p>
+      <w:pPr>
+        <w:pStyle w:val="FirstParagraph"/>
+      </w:pPr>
+      <w:r>
+        <w:t xml:space="preserve">Sans le sel conservé hors-site, la dérivation est irréalisable sur du matériel neuf : la passphrase seule ne suffit pas. C’est le point critique de toute architecture de ce type, et il doit être traité explicitement, non implicitement.</w:t>
+      </w:r>
+    </w:p>
+    <w:bookmarkEnd w:id="30"/>
+    <w:bookmarkStart w:id="31" w:name="déploiement-étapes-génériques"/>
     <w:p>
       <w:pPr>
         <w:pStyle w:val="Heading2"/>
       </w:pPr>
       <w:r>
-        <w:t xml:space="preserve">11. Limites et travaux futurs</w:t>
+        <w:t xml:space="preserve">10. Déploiement — étapes génériques</w:t>
       </w:r>
     </w:p>
     <w:p>
@@ -1052,174 +1096,7 @@
         </w:numPr>
       </w:pPr>
       <w:r>
-        <w:rPr>
-          <w:b/>
-          <w:bCs/>
-        </w:rPr>
-        <w:t xml:space="preserve">Durcissement evil-maid :</w:t>
-      </w:r>
-      <w:r>
-        <w:t xml:space="preserve"> </w:t>
-      </w:r>
-      <w:r>
-        <w:t xml:space="preserve">l’amorçage reste en clair. Le démarrage sécurisé est la</w:t>
-      </w:r>
-      <w:r>
-        <w:t xml:space="preserve"> </w:t>
-      </w:r>
-      <w:r>
-        <w:t xml:space="preserve">seule parade réellement envisagée, et son coût a été mesuré :</w:t>
-      </w:r>
-    </w:p>
-    <w:p>
-      <w:pPr>
-        <w:pStyle w:val="Compact"/>
-        <w:numPr>
-          <w:ilvl w:val="1"/>
-          <w:numId w:val="1006"/>
-        </w:numPr>
-      </w:pPr>
-      <w:r>
-        <w:rPr>
-          <w:b/>
-          <w:bCs/>
-        </w:rPr>
-        <w:t xml:space="preserve">signer le noyau ne suffit pas.</w:t>
-      </w:r>
-      <w:r>
-        <w:t xml:space="preserve"> </w:t>
-      </w:r>
-      <w:r>
-        <w:t xml:space="preserve">L’initramfs porte le keyscript, le binaire de</w:t>
-      </w:r>
-      <w:r>
-        <w:t xml:space="preserve"> </w:t>
-      </w:r>
-      <w:r>
-        <w:t xml:space="preserve">dérivation et le sel ; il n’est pas couvert par la signature du noyau seul. Il</w:t>
-      </w:r>
-      <w:r>
-        <w:t xml:space="preserve"> </w:t>
-      </w:r>
-      <w:r>
-        <w:t xml:space="preserve">faut une</w:t>
-      </w:r>
-      <w:r>
-        <w:t xml:space="preserve"> </w:t>
-      </w:r>
-      <w:r>
-        <w:rPr>
-          <w:b/>
-          <w:bCs/>
-        </w:rPr>
-        <w:t xml:space="preserve">image unifiée</w:t>
-      </w:r>
-      <w:r>
-        <w:t xml:space="preserve"> </w:t>
-      </w:r>
-      <w:r>
-        <w:t xml:space="preserve">(noyau + initramfs + ligne de commande en un seul</w:t>
-      </w:r>
-      <w:r>
-        <w:t xml:space="preserve"> </w:t>
-      </w:r>
-      <w:r>
-        <w:t xml:space="preserve">binaire signé), donc changer de chaîne d’amorçage ;</w:t>
-      </w:r>
-    </w:p>
-    <w:p>
-      <w:pPr>
-        <w:pStyle w:val="Compact"/>
-        <w:numPr>
-          <w:ilvl w:val="1"/>
-          <w:numId w:val="1006"/>
-        </w:numPr>
-      </w:pPr>
-      <w:r>
-        <w:t xml:space="preserve">le</w:t>
-      </w:r>
-      <w:r>
-        <w:t xml:space="preserve"> </w:t>
-      </w:r>
-      <w:r>
-        <w:rPr>
-          <w:b/>
-          <w:bCs/>
-        </w:rPr>
-        <w:t xml:space="preserve">verrouillage du noyau</w:t>
-      </w:r>
-      <w:r>
-        <w:t xml:space="preserve"> </w:t>
-      </w:r>
-      <w:r>
-        <w:t xml:space="preserve">qui accompagne le démarrage sécurisé</w:t>
-      </w:r>
-      <w:r>
-        <w:t xml:space="preserve"> </w:t>
-      </w:r>
-      <w:r>
-        <w:rPr>
-          <w:b/>
-          <w:bCs/>
-        </w:rPr>
-        <w:t xml:space="preserve">supprime</w:t>
-      </w:r>
-      <w:r>
-        <w:rPr>
-          <w:b/>
-          <w:bCs/>
-        </w:rPr>
-        <w:t xml:space="preserve"> </w:t>
-      </w:r>
-      <w:r>
-        <w:rPr>
-          <w:b/>
-          <w:bCs/>
-        </w:rPr>
-        <w:t xml:space="preserve">l’hibernation</w:t>
-      </w:r>
-      <w:r>
-        <w:t xml:space="preserve"> </w:t>
-      </w:r>
-      <w:r>
-        <w:t xml:space="preserve">— l’image de veille prolongée n’étant pas vérifiable, elle est</w:t>
-      </w:r>
-      <w:r>
-        <w:t xml:space="preserve"> </w:t>
-      </w:r>
-      <w:r>
-        <w:t xml:space="preserve">refusée. C’est un renoncement fonctionnel, pas un réglage ;</w:t>
-      </w:r>
-    </w:p>
-    <w:p>
-      <w:pPr>
-        <w:pStyle w:val="Compact"/>
-        <w:numPr>
-          <w:ilvl w:val="1"/>
-          <w:numId w:val="1006"/>
-        </w:numPr>
-      </w:pPr>
-      <w:r>
-        <w:t xml:space="preserve">à recommander par défaut</w:t>
-      </w:r>
-      <w:r>
-        <w:t xml:space="preserve"> </w:t>
-      </w:r>
-      <w:r>
-        <w:rPr>
-          <w:b/>
-          <w:bCs/>
-        </w:rPr>
-        <w:t xml:space="preserve">sur poste fixe</w:t>
-      </w:r>
-      <w:r>
-        <w:t xml:space="preserve">, où l’hibernation ne manque pas ;</w:t>
-      </w:r>
-      <w:r>
-        <w:t xml:space="preserve"> </w:t>
-      </w:r>
-      <w:r>
-        <w:t xml:space="preserve">sur portable, l’arbitrage revient à l’utilisateur.</w:t>
+        <w:t xml:space="preserve">Installer le système en chiffrement intégral (volume racine LUKS2).</w:t>
       </w:r>
     </w:p>
     <w:p>
@@ -1231,17 +1108,7 @@
         </w:numPr>
       </w:pPr>
       <w:r>
-        <w:rPr>
-          <w:b/>
-          <w:bCs/>
-        </w:rPr>
-        <w:t xml:space="preserve">Mesure d’intégrité matérielle</w:t>
-      </w:r>
-      <w:r>
-        <w:t xml:space="preserve"> </w:t>
-      </w:r>
-      <w:r>
-        <w:t xml:space="preserve">(TPM) : à étudier, non instruite à ce jour.</w:t>
+        <w:t xml:space="preserve">Déployer la fonction de dérivation et le sel de déploiement.</w:t>
       </w:r>
     </w:p>
     <w:p>
@@ -1253,17 +1120,7 @@
         </w:numPr>
       </w:pPr>
       <w:r>
-        <w:rPr>
-          <w:b/>
-          <w:bCs/>
-        </w:rPr>
-        <w:t xml:space="preserve">Quorum distribué :</w:t>
-      </w:r>
-      <w:r>
-        <w:t xml:space="preserve"> </w:t>
-      </w:r>
-      <w:r>
-        <w:t xml:space="preserve">déverrouillage automatique par consensus de témoins, sans saisie, en réflexion.</w:t>
+        <w:t xml:space="preserve">Ajouter un slot « récupération » sur chaque volume (clé dérivée, étiquette « disk »), en conservant le slot natif.</w:t>
       </w:r>
     </w:p>
     <w:p>
@@ -1272,6 +1129,275 @@
         <w:numPr>
           <w:ilvl w:val="0"/>
           <w:numId w:val="1005"/>
+        </w:numPr>
+      </w:pPr>
+      <w:r>
+        <w:t xml:space="preserve">Volume racine : keyscript dans la table de chiffrement + serveur SSH minimal dans l’image d’amorçage.</w:t>
+      </w:r>
+    </w:p>
+    <w:p>
+      <w:pPr>
+        <w:pStyle w:val="Compact"/>
+        <w:numPr>
+          <w:ilvl w:val="0"/>
+          <w:numId w:val="1005"/>
+        </w:numPr>
+      </w:pPr>
+      <w:r>
+        <w:t xml:space="preserve">Volumes secondaires : fichier-clé sur la racine + référence dans la table de chiffrement (montés après le pivot).</w:t>
+      </w:r>
+    </w:p>
+    <w:p>
+      <w:pPr>
+        <w:pStyle w:val="Compact"/>
+        <w:numPr>
+          <w:ilvl w:val="0"/>
+          <w:numId w:val="1005"/>
+        </w:numPr>
+      </w:pPr>
+      <w:r>
+        <w:t xml:space="preserve">Régénérer l’image d’amorçage, sauvegarder l’image précédente, puis tester par redémarrage avec filet (slot natif + accès console).</w:t>
+      </w:r>
+    </w:p>
+    <w:bookmarkEnd w:id="31"/>
+    <w:bookmarkStart w:id="32" w:name="limites-et-travaux-futurs"/>
+    <w:p>
+      <w:pPr>
+        <w:pStyle w:val="Heading2"/>
+      </w:pPr>
+      <w:r>
+        <w:t xml:space="preserve">11. Limites et travaux futurs</w:t>
+      </w:r>
+    </w:p>
+    <w:p>
+      <w:pPr>
+        <w:pStyle w:val="Compact"/>
+        <w:numPr>
+          <w:ilvl w:val="0"/>
+          <w:numId w:val="1006"/>
+        </w:numPr>
+      </w:pPr>
+      <w:r>
+        <w:rPr>
+          <w:b/>
+          <w:bCs/>
+        </w:rPr>
+        <w:t xml:space="preserve">Durcissement evil-maid :</w:t>
+      </w:r>
+      <w:r>
+        <w:t xml:space="preserve"> </w:t>
+      </w:r>
+      <w:r>
+        <w:t xml:space="preserve">l’amorçage reste en clair. Le démarrage sécurisé est la</w:t>
+      </w:r>
+      <w:r>
+        <w:t xml:space="preserve"> </w:t>
+      </w:r>
+      <w:r>
+        <w:t xml:space="preserve">seule parade réellement envisagée, et son coût a été mesuré :</w:t>
+      </w:r>
+    </w:p>
+    <w:p>
+      <w:pPr>
+        <w:pStyle w:val="Compact"/>
+        <w:numPr>
+          <w:ilvl w:val="1"/>
+          <w:numId w:val="1007"/>
+        </w:numPr>
+      </w:pPr>
+      <w:r>
+        <w:rPr>
+          <w:b/>
+          <w:bCs/>
+        </w:rPr>
+        <w:t xml:space="preserve">signer le noyau ne suffit pas.</w:t>
+      </w:r>
+      <w:r>
+        <w:t xml:space="preserve"> </w:t>
+      </w:r>
+      <w:r>
+        <w:t xml:space="preserve">L’initramfs porte le keyscript, le binaire de</w:t>
+      </w:r>
+      <w:r>
+        <w:t xml:space="preserve"> </w:t>
+      </w:r>
+      <w:r>
+        <w:t xml:space="preserve">dérivation et le sel ; il n’est pas couvert par la signature du noyau seul. Il</w:t>
+      </w:r>
+      <w:r>
+        <w:t xml:space="preserve"> </w:t>
+      </w:r>
+      <w:r>
+        <w:t xml:space="preserve">faut une</w:t>
+      </w:r>
+      <w:r>
+        <w:t xml:space="preserve"> </w:t>
+      </w:r>
+      <w:r>
+        <w:rPr>
+          <w:b/>
+          <w:bCs/>
+        </w:rPr>
+        <w:t xml:space="preserve">image unifiée</w:t>
+      </w:r>
+      <w:r>
+        <w:t xml:space="preserve"> </w:t>
+      </w:r>
+      <w:r>
+        <w:t xml:space="preserve">(noyau + initramfs + ligne de commande en un seul</w:t>
+      </w:r>
+      <w:r>
+        <w:t xml:space="preserve"> </w:t>
+      </w:r>
+      <w:r>
+        <w:t xml:space="preserve">binaire signé), donc changer de chaîne d’amorçage ;</w:t>
+      </w:r>
+    </w:p>
+    <w:p>
+      <w:pPr>
+        <w:pStyle w:val="Compact"/>
+        <w:numPr>
+          <w:ilvl w:val="1"/>
+          <w:numId w:val="1007"/>
+        </w:numPr>
+      </w:pPr>
+      <w:r>
+        <w:t xml:space="preserve">le</w:t>
+      </w:r>
+      <w:r>
+        <w:t xml:space="preserve"> </w:t>
+      </w:r>
+      <w:r>
+        <w:rPr>
+          <w:b/>
+          <w:bCs/>
+        </w:rPr>
+        <w:t xml:space="preserve">verrouillage du noyau</w:t>
+      </w:r>
+      <w:r>
+        <w:t xml:space="preserve"> </w:t>
+      </w:r>
+      <w:r>
+        <w:t xml:space="preserve">qui accompagne le démarrage sécurisé</w:t>
+      </w:r>
+      <w:r>
+        <w:t xml:space="preserve"> </w:t>
+      </w:r>
+      <w:r>
+        <w:rPr>
+          <w:b/>
+          <w:bCs/>
+        </w:rPr>
+        <w:t xml:space="preserve">supprime</w:t>
+      </w:r>
+      <w:r>
+        <w:rPr>
+          <w:b/>
+          <w:bCs/>
+        </w:rPr>
+        <w:t xml:space="preserve"> </w:t>
+      </w:r>
+      <w:r>
+        <w:rPr>
+          <w:b/>
+          <w:bCs/>
+        </w:rPr>
+        <w:t xml:space="preserve">l’hibernation</w:t>
+      </w:r>
+      <w:r>
+        <w:t xml:space="preserve"> </w:t>
+      </w:r>
+      <w:r>
+        <w:t xml:space="preserve">— l’image de veille prolongée n’étant pas vérifiable, elle est</w:t>
+      </w:r>
+      <w:r>
+        <w:t xml:space="preserve"> </w:t>
+      </w:r>
+      <w:r>
+        <w:t xml:space="preserve">refusée. C’est un renoncement fonctionnel, pas un réglage ;</w:t>
+      </w:r>
+    </w:p>
+    <w:p>
+      <w:pPr>
+        <w:pStyle w:val="Compact"/>
+        <w:numPr>
+          <w:ilvl w:val="1"/>
+          <w:numId w:val="1007"/>
+        </w:numPr>
+      </w:pPr>
+      <w:r>
+        <w:t xml:space="preserve">à recommander par défaut</w:t>
+      </w:r>
+      <w:r>
+        <w:t xml:space="preserve"> </w:t>
+      </w:r>
+      <w:r>
+        <w:rPr>
+          <w:b/>
+          <w:bCs/>
+        </w:rPr>
+        <w:t xml:space="preserve">sur poste fixe</w:t>
+      </w:r>
+      <w:r>
+        <w:t xml:space="preserve">, où l’hibernation ne manque pas ;</w:t>
+      </w:r>
+      <w:r>
+        <w:t xml:space="preserve"> </w:t>
+      </w:r>
+      <w:r>
+        <w:t xml:space="preserve">sur portable, l’arbitrage revient à l’utilisateur.</w:t>
+      </w:r>
+    </w:p>
+    <w:p>
+      <w:pPr>
+        <w:pStyle w:val="Compact"/>
+        <w:numPr>
+          <w:ilvl w:val="0"/>
+          <w:numId w:val="1006"/>
+        </w:numPr>
+      </w:pPr>
+      <w:r>
+        <w:rPr>
+          <w:b/>
+          <w:bCs/>
+        </w:rPr>
+        <w:t xml:space="preserve">Mesure d’intégrité matérielle</w:t>
+      </w:r>
+      <w:r>
+        <w:t xml:space="preserve"> </w:t>
+      </w:r>
+      <w:r>
+        <w:t xml:space="preserve">(TPM) : à étudier, non instruite à ce jour.</w:t>
+      </w:r>
+    </w:p>
+    <w:p>
+      <w:pPr>
+        <w:pStyle w:val="Compact"/>
+        <w:numPr>
+          <w:ilvl w:val="0"/>
+          <w:numId w:val="1006"/>
+        </w:numPr>
+      </w:pPr>
+      <w:r>
+        <w:rPr>
+          <w:b/>
+          <w:bCs/>
+        </w:rPr>
+        <w:t xml:space="preserve">Quorum distribué :</w:t>
+      </w:r>
+      <w:r>
+        <w:t xml:space="preserve"> </w:t>
+      </w:r>
+      <w:r>
+        <w:t xml:space="preserve">déverrouillage automatique par consensus de témoins, sans saisie, en réflexion.</w:t>
+      </w:r>
+    </w:p>
+    <w:p>
+      <w:pPr>
+        <w:pStyle w:val="Compact"/>
+        <w:numPr>
+          <w:ilvl w:val="0"/>
+          <w:numId w:val="1006"/>
         </w:numPr>
       </w:pPr>
       <w:r>
@@ -1588,6 +1714,9 @@
     <w:abstractNumId w:val="991"/>
   </w:num>
   <w:num w:numId="1004">
+    <w:abstractNumId w:val="991"/>
+  </w:num>
+  <w:num w:numId="1005">
     <w:abstractNumId w:val="99411"/>
     <w:lvlOverride w:ilvl="0">
       <w:startOverride w:val="1"/>
@@ -1617,10 +1746,10 @@
       <w:startOverride w:val="1"/>
     </w:lvlOverride>
   </w:num>
-  <w:num w:numId="1005">
+  <w:num w:numId="1006">
     <w:abstractNumId w:val="991"/>
   </w:num>
-  <w:num w:numId="1006">
+  <w:num w:numId="1007">
     <w:abstractNumId w:val="991"/>
   </w:num>
 </w:numbering>

</xml_diff>